<commit_message>
Updating game for v0.6.4
</commit_message>
<xml_diff>
--- a/Assessment 3/Ben Timewell - F122A12 - 3. Test, Finalise, and Review a Prototype Game.docx
+++ b/Assessment 3/Ben Timewell - F122A12 - 3. Test, Finalise, and Review a Prototype Game.docx
@@ -1,6 +1,6 @@
 
 <file path=word/document.xml><?xml version="1.0" encoding="utf-8"?>
-<w:document xmlns:wpc="http://schemas.microsoft.com/office/word/2010/wordprocessingCanvas" xmlns:cx="http://schemas.microsoft.com/office/drawing/2014/chartex" xmlns:cx1="http://schemas.microsoft.com/office/drawing/2015/9/8/chartex" xmlns:cx2="http://schemas.microsoft.com/office/drawing/2015/10/21/chartex" xmlns:cx3="http://schemas.microsoft.com/office/drawing/2016/5/9/chartex" xmlns:cx4="http://schemas.microsoft.com/office/drawing/2016/5/10/chartex" xmlns:cx5="http://schemas.microsoft.com/office/drawing/2016/5/11/chartex" xmlns:cx6="http://schemas.microsoft.com/office/drawing/2016/5/12/chartex" xmlns:cx7="http://schemas.microsoft.com/office/drawing/2016/5/13/chartex" xmlns:cx8="http://schemas.microsoft.com/office/drawing/2016/5/14/chartex" xmlns:mc="http://schemas.openxmlformats.org/markup-compatibility/2006" xmlns:aink="http://schemas.microsoft.com/office/drawing/2016/ink" xmlns:am3d="http://schemas.microsoft.com/office/drawing/2017/model3d" xmlns:o="urn:schemas-microsoft-com:office:office" xmlns:oel="http://schemas.microsoft.com/office/2019/extlst" xmlns:r="http://schemas.openxmlformats.org/officeDocument/2006/relationships" xmlns:m="http://schemas.openxmlformats.org/officeDocument/2006/math" xmlns:v="urn:schemas-microsoft-com:vml" xmlns:wp14="http://schemas.microsoft.com/office/word/2010/wordprocessingDrawing" xmlns:wp="http://schemas.openxmlformats.org/drawingml/2006/wordprocessingDrawing" xmlns:w10="urn:schemas-microsoft-com:office:word" xmlns:w="http://schemas.openxmlformats.org/wordprocessingml/2006/main" xmlns:w14="http://schemas.microsoft.com/office/word/2010/wordml" xmlns:w15="http://schemas.microsoft.com/office/word/2012/wordml" xmlns:w16cex="http://schemas.microsoft.com/office/word/2018/wordml/cex" xmlns:w16cid="http://schemas.microsoft.com/office/word/2016/wordml/cid" xmlns:w16="http://schemas.microsoft.com/office/word/2018/wordml" xmlns:w16du="http://schemas.microsoft.com/office/word/2023/wordml/word16du" xmlns:w16sdtdh="http://schemas.microsoft.com/office/word/2020/wordml/sdtdatahash" xmlns:w16sdtfl="http://schemas.microsoft.com/office/word/2024/wordml/sdtformatlock" xmlns:w16se="http://schemas.microsoft.com/office/word/2015/wordml/symex" xmlns:wpg="http://schemas.microsoft.com/office/word/2010/wordprocessingGroup" xmlns:wpi="http://schemas.microsoft.com/office/word/2010/wordprocessingInk" xmlns:wne="http://schemas.microsoft.com/office/word/2006/wordml" xmlns:wps="http://schemas.microsoft.com/office/word/2010/wordprocessingShape" mc:Ignorable="w14 w15 w16se w16cid w16 w16cex w16sdtdh w16sdtfl w16du wp14">
+<w:document xmlns:wpc="http://schemas.microsoft.com/office/word/2010/wordprocessingCanvas" xmlns:cx="http://schemas.microsoft.com/office/drawing/2014/chartex" xmlns:cx1="http://schemas.microsoft.com/office/drawing/2015/9/8/chartex" xmlns:cx2="http://schemas.microsoft.com/office/drawing/2015/10/21/chartex" xmlns:cx3="http://schemas.microsoft.com/office/drawing/2016/5/9/chartex" xmlns:cx4="http://schemas.microsoft.com/office/drawing/2016/5/10/chartex" xmlns:cx5="http://schemas.microsoft.com/office/drawing/2016/5/11/chartex" xmlns:cx6="http://schemas.microsoft.com/office/drawing/2016/5/12/chartex" xmlns:cx7="http://schemas.microsoft.com/office/drawing/2016/5/13/chartex" xmlns:cx8="http://schemas.microsoft.com/office/drawing/2016/5/14/chartex" xmlns:mc="http://schemas.openxmlformats.org/markup-compatibility/2006" xmlns:aink="http://schemas.microsoft.com/office/drawing/2016/ink" xmlns:am3d="http://schemas.microsoft.com/office/drawing/2017/model3d" xmlns:o="urn:schemas-microsoft-com:office:office" xmlns:oel="http://schemas.microsoft.com/office/2019/extlst" xmlns:r="http://schemas.openxmlformats.org/officeDocument/2006/relationships" xmlns:m="http://schemas.openxmlformats.org/officeDocument/2006/math" xmlns:v="urn:schemas-microsoft-com:vml" xmlns:wp14="http://schemas.microsoft.com/office/word/2010/wordprocessingDrawing" xmlns:wp="http://schemas.openxmlformats.org/drawingml/2006/wordprocessingDrawing" xmlns:w10="urn:schemas-microsoft-com:office:word" xmlns:w="http://schemas.openxmlformats.org/wordprocessingml/2006/main" xmlns:w14="http://schemas.microsoft.com/office/word/2010/wordml" xmlns:w15="http://schemas.microsoft.com/office/word/2012/wordml" xmlns:w16cex="http://schemas.microsoft.com/office/word/2018/wordml/cex" xmlns:w16cid="http://schemas.microsoft.com/office/word/2016/wordml/cid" xmlns:w16="http://schemas.microsoft.com/office/word/2018/wordml" xmlns:w16sdtdh="http://schemas.microsoft.com/office/word/2020/wordml/sdtdatahash" xmlns:w16se="http://schemas.microsoft.com/office/word/2015/wordml/symex" xmlns:wpg="http://schemas.microsoft.com/office/word/2010/wordprocessingGroup" xmlns:wpi="http://schemas.microsoft.com/office/word/2010/wordprocessingInk" xmlns:wne="http://schemas.microsoft.com/office/word/2006/wordml" xmlns:wps="http://schemas.microsoft.com/office/word/2010/wordprocessingShape" mc:Ignorable="w14 w15 w16se w16cid w16 w16cex w16sdtdh wp14">
   <w:body>
     <w:p>
       <w:pPr>
@@ -1211,6 +1211,20 @@
               </w:rPr>
               <w:t>Name:</w:t>
             </w:r>
+            <w:r>
+              <w:rPr>
+                <w:rFonts w:ascii="Calibri" w:eastAsia="Calibri" w:hAnsi="Calibri" w:cs="Times New Roman"/>
+                <w:szCs w:val="22"/>
+              </w:rPr>
+              <w:t xml:space="preserve"> </w:t>
+            </w:r>
+            <w:r>
+              <w:rPr>
+                <w:rFonts w:ascii="Calibri" w:eastAsia="Calibri" w:hAnsi="Calibri" w:cs="Times New Roman"/>
+                <w:szCs w:val="22"/>
+              </w:rPr>
+              <w:t>Thomas Devenish</w:t>
+            </w:r>
           </w:p>
           <w:p>
             <w:pPr>
@@ -1227,6 +1241,13 @@
                 <w:szCs w:val="22"/>
               </w:rPr>
               <w:t>Date:</w:t>
+            </w:r>
+            <w:r>
+              <w:rPr>
+                <w:rFonts w:ascii="Calibri" w:eastAsia="Calibri" w:hAnsi="Calibri" w:cs="Times New Roman"/>
+                <w:szCs w:val="22"/>
+              </w:rPr>
+              <w:t xml:space="preserve"> 21/05/2026</w:t>
             </w:r>
           </w:p>
         </w:tc>
@@ -1276,6 +1297,38 @@
                 <w:szCs w:val="22"/>
               </w:rPr>
             </w:pPr>
+            <w:r>
+              <w:rPr>
+                <w:rFonts w:ascii="Calibri" w:eastAsia="Calibri" w:hAnsi="Calibri" w:cs="Times New Roman"/>
+                <w:szCs w:val="22"/>
+              </w:rPr>
+              <w:t>Game ran well. It was possible to spawn an infinite number of aliens which does eventually cause the game to start spasming in the moments where they all attempt to find a path</w:t>
+            </w:r>
+          </w:p>
+          <w:p>
+            <w:pPr>
+              <w:contextualSpacing/>
+              <w:rPr>
+                <w:rFonts w:ascii="Calibri" w:eastAsia="Calibri" w:hAnsi="Calibri" w:cs="Times New Roman"/>
+                <w:szCs w:val="22"/>
+              </w:rPr>
+            </w:pPr>
+          </w:p>
+          <w:p>
+            <w:pPr>
+              <w:contextualSpacing/>
+              <w:rPr>
+                <w:rFonts w:ascii="Calibri" w:eastAsia="Calibri" w:hAnsi="Calibri" w:cs="Times New Roman"/>
+                <w:szCs w:val="22"/>
+              </w:rPr>
+            </w:pPr>
+            <w:r>
+              <w:rPr>
+                <w:rFonts w:ascii="Calibri" w:eastAsia="Calibri" w:hAnsi="Calibri" w:cs="Times New Roman"/>
+                <w:szCs w:val="22"/>
+              </w:rPr>
+              <w:t>The non-alien NPCs also start breaking because the pathfinding system is overloaded.</w:t>
+            </w:r>
           </w:p>
           <w:p>
             <w:pPr>
@@ -1344,6 +1397,13 @@
                 <w:szCs w:val="22"/>
               </w:rPr>
             </w:pPr>
+            <w:r>
+              <w:rPr>
+                <w:rFonts w:ascii="Calibri" w:eastAsia="Calibri" w:hAnsi="Calibri" w:cs="Times New Roman"/>
+                <w:szCs w:val="22"/>
+              </w:rPr>
+              <w:t>The style and the fact that spawning enough enemies to break the pathfinding was the only way to slow the aliens was quite entertaining.</w:t>
+            </w:r>
           </w:p>
           <w:p>
             <w:pPr>
@@ -1364,6 +1424,13 @@
                 <w:szCs w:val="22"/>
               </w:rPr>
             </w:pPr>
+            <w:r>
+              <w:rPr>
+                <w:rFonts w:ascii="Calibri" w:eastAsia="Calibri" w:hAnsi="Calibri" w:cs="Times New Roman"/>
+                <w:szCs w:val="22"/>
+              </w:rPr>
+              <w:t>Only critique would be that there is no other way to slow the aliens down – some other mechanics might be fun.</w:t>
+            </w:r>
           </w:p>
         </w:tc>
       </w:tr>
@@ -1413,6 +1480,13 @@
                 <w:szCs w:val="22"/>
               </w:rPr>
             </w:pPr>
+            <w:r>
+              <w:rPr>
+                <w:rFonts w:ascii="Calibri" w:eastAsia="Calibri" w:hAnsi="Calibri" w:cs="Times New Roman"/>
+                <w:szCs w:val="22"/>
+              </w:rPr>
+              <w:t>There was, however the font colour was a bit hard to read so I would recommend updating that</w:t>
+            </w:r>
           </w:p>
           <w:p>
             <w:pPr>
@@ -1482,6 +1556,13 @@
                 <w:szCs w:val="22"/>
               </w:rPr>
             </w:pPr>
+            <w:r>
+              <w:rPr>
+                <w:rFonts w:ascii="Calibri" w:eastAsia="Calibri" w:hAnsi="Calibri" w:cs="Times New Roman"/>
+                <w:szCs w:val="22"/>
+              </w:rPr>
+              <w:t>No</w:t>
+            </w:r>
           </w:p>
           <w:p>
             <w:pPr>
@@ -2413,13 +2494,57 @@
           <w:tcPr>
             <w:tcW w:w="10194" w:type="dxa"/>
           </w:tcPr>
+          <w:p>
+            <w:r>
+              <w:t xml:space="preserve">The testing process went well. I did not explain anything to the tests prior to starting the game, simply “please test my game”. I did this purposely because I wanted to test my in-game instructions. </w:t>
+            </w:r>
+            <w:r>
+              <w:t xml:space="preserve">While I sat with the testers, I only answered direct questions from them, so I could ensure they had no outside influence on how the game </w:t>
+            </w:r>
+            <w:r>
+              <w:rPr>
+                <w:i/>
+                <w:iCs/>
+              </w:rPr>
+              <w:t>should</w:t>
+            </w:r>
+            <w:r>
+              <w:t xml:space="preserve"> run, I preferred they figured that out themselves so I could get good quality feedback.</w:t>
+            </w:r>
+          </w:p>
           <w:p/>
+          <w:p>
+            <w:r>
+              <w:t xml:space="preserve">The feedback received was overall good. Main points being </w:t>
+            </w:r>
+            <w:r>
+              <w:t>controls were inverted and should be swapped</w:t>
+            </w:r>
+            <w:r>
+              <w:t xml:space="preserve"> and hard to read </w:t>
+            </w:r>
+            <w:r>
+              <w:t>introduction</w:t>
+            </w:r>
+            <w:r>
+              <w:t xml:space="preserve"> text. Both of which I agreed with and </w:t>
+            </w:r>
+            <w:r>
+              <w:t>have adjusted in the final version.</w:t>
+            </w:r>
+          </w:p>
           <w:p/>
-          <w:p/>
-          <w:p/>
-          <w:p/>
-          <w:p/>
-          <w:p/>
+          <w:p>
+            <w:r>
+              <w:t xml:space="preserve">The GUI focus test </w:t>
+            </w:r>
+            <w:r>
+              <w:t xml:space="preserve">was a tricky one, as the game was tied around clicking a button to start, then reading the intro text, but by removing the timings between button clicks, it allowed the testers to quickly </w:t>
+            </w:r>
+            <w:r>
+              <w:t>try out menus without needing to wait for in-game actions to finish.</w:t>
+            </w:r>
+          </w:p>
           <w:p/>
         </w:tc>
       </w:tr>
@@ -2475,7 +2600,13 @@
         <w:t>If there were not that many things to address then you can add to this by mentioning any additional changes you made that were not directly mentioned in user feedback</w:t>
       </w:r>
       <w:r>
-        <w:t xml:space="preserve"> but ma have been influenced by the testing process</w:t>
+        <w:t xml:space="preserve"> but ma</w:t>
+      </w:r>
+      <w:r>
+        <w:t>y</w:t>
+      </w:r>
+      <w:r>
+        <w:t xml:space="preserve"> have been influenced by the testing process</w:t>
       </w:r>
     </w:p>
     <w:p/>
@@ -2493,14 +2624,222 @@
           <w:tcPr>
             <w:tcW w:w="10194" w:type="dxa"/>
           </w:tcPr>
+          <w:p>
+            <w:pPr>
+              <w:jc w:val="center"/>
+              <w:rPr>
+                <w:b/>
+                <w:bCs w:val="0"/>
+              </w:rPr>
+            </w:pPr>
+          </w:p>
+          <w:tbl>
+            <w:tblPr>
+              <w:tblStyle w:val="TableGrid"/>
+              <w:tblW w:w="0" w:type="auto"/>
+              <w:tblLook w:val="04A0" w:firstRow="1" w:lastRow="0" w:firstColumn="1" w:lastColumn="0" w:noHBand="0" w:noVBand="1"/>
+            </w:tblPr>
+            <w:tblGrid>
+              <w:gridCol w:w="4948"/>
+              <w:gridCol w:w="5020"/>
+            </w:tblGrid>
+            <w:tr>
+              <w:tc>
+                <w:tcPr>
+                  <w:tcW w:w="4984" w:type="dxa"/>
+                </w:tcPr>
+                <w:p>
+                  <w:pPr>
+                    <w:jc w:val="center"/>
+                    <w:rPr>
+                      <w:b/>
+                      <w:bCs w:val="0"/>
+                    </w:rPr>
+                  </w:pPr>
+                  <w:r>
+                    <w:rPr>
+                      <w:b/>
+                      <w:bCs w:val="0"/>
+                    </w:rPr>
+                    <w:t>Introduction Screen prior to changes</w:t>
+                  </w:r>
+                </w:p>
+              </w:tc>
+              <w:tc>
+                <w:tcPr>
+                  <w:tcW w:w="4984" w:type="dxa"/>
+                </w:tcPr>
+                <w:p>
+                  <w:pPr>
+                    <w:jc w:val="center"/>
+                    <w:rPr>
+                      <w:b/>
+                      <w:bCs w:val="0"/>
+                    </w:rPr>
+                  </w:pPr>
+                  <w:r>
+                    <w:rPr>
+                      <w:b/>
+                      <w:bCs w:val="0"/>
+                    </w:rPr>
+                    <w:t xml:space="preserve">Introduction Screen </w:t>
+                  </w:r>
+                  <w:r>
+                    <w:rPr>
+                      <w:b/>
+                      <w:bCs w:val="0"/>
+                    </w:rPr>
+                    <w:t>after</w:t>
+                  </w:r>
+                  <w:r>
+                    <w:rPr>
+                      <w:b/>
+                      <w:bCs w:val="0"/>
+                    </w:rPr>
+                    <w:t xml:space="preserve"> changes</w:t>
+                  </w:r>
+                </w:p>
+              </w:tc>
+            </w:tr>
+            <w:tr>
+              <w:tc>
+                <w:tcPr>
+                  <w:tcW w:w="4984" w:type="dxa"/>
+                </w:tcPr>
+                <w:p>
+                  <w:pPr>
+                    <w:jc w:val="center"/>
+                    <w:rPr>
+                      <w:b/>
+                      <w:bCs w:val="0"/>
+                    </w:rPr>
+                  </w:pPr>
+                  <w:r>
+                    <w:rPr>
+                      <w:noProof/>
+                    </w:rPr>
+                    <w:drawing>
+                      <wp:inline distT="0" distB="0" distL="0" distR="0" wp14:anchorId="4914B1FB" wp14:editId="33AFE8C3">
+                        <wp:extent cx="3060634" cy="1717481"/>
+                        <wp:effectExtent l="0" t="0" r="6985" b="0"/>
+                        <wp:docPr id="1867495089" name="Picture 1"/>
+                        <wp:cNvGraphicFramePr>
+                          <a:graphicFrameLocks xmlns:a="http://schemas.openxmlformats.org/drawingml/2006/main" noChangeAspect="1"/>
+                        </wp:cNvGraphicFramePr>
+                        <a:graphic xmlns:a="http://schemas.openxmlformats.org/drawingml/2006/main">
+                          <a:graphicData uri="http://schemas.openxmlformats.org/drawingml/2006/picture">
+                            <pic:pic xmlns:pic="http://schemas.openxmlformats.org/drawingml/2006/picture">
+                              <pic:nvPicPr>
+                                <pic:cNvPr id="1867495089" name=""/>
+                                <pic:cNvPicPr/>
+                              </pic:nvPicPr>
+                              <pic:blipFill>
+                                <a:blip r:embed="rId12"/>
+                                <a:stretch>
+                                  <a:fillRect/>
+                                </a:stretch>
+                              </pic:blipFill>
+                              <pic:spPr>
+                                <a:xfrm>
+                                  <a:off x="0" y="0"/>
+                                  <a:ext cx="3123651" cy="1752843"/>
+                                </a:xfrm>
+                                <a:prstGeom prst="rect">
+                                  <a:avLst/>
+                                </a:prstGeom>
+                              </pic:spPr>
+                            </pic:pic>
+                          </a:graphicData>
+                        </a:graphic>
+                      </wp:inline>
+                    </w:drawing>
+                  </w:r>
+                </w:p>
+              </w:tc>
+              <w:tc>
+                <w:tcPr>
+                  <w:tcW w:w="4984" w:type="dxa"/>
+                </w:tcPr>
+                <w:p>
+                  <w:pPr>
+                    <w:jc w:val="center"/>
+                    <w:rPr>
+                      <w:b/>
+                      <w:bCs w:val="0"/>
+                    </w:rPr>
+                  </w:pPr>
+                  <w:r>
+                    <w:rPr>
+                      <w:b/>
+                      <w:bCs w:val="0"/>
+                      <w:iCs/>
+                    </w:rPr>
+                    <w:drawing>
+                      <wp:inline distT="0" distB="0" distL="0" distR="0" wp14:anchorId="2E121726" wp14:editId="36A9F545">
+                        <wp:extent cx="3113798" cy="1685676"/>
+                        <wp:effectExtent l="0" t="0" r="0" b="0"/>
+                        <wp:docPr id="2" name="Picture 2"/>
+                        <wp:cNvGraphicFramePr>
+                          <a:graphicFrameLocks xmlns:a="http://schemas.openxmlformats.org/drawingml/2006/main" noChangeAspect="1"/>
+                        </wp:cNvGraphicFramePr>
+                        <a:graphic xmlns:a="http://schemas.openxmlformats.org/drawingml/2006/main">
+                          <a:graphicData uri="http://schemas.openxmlformats.org/drawingml/2006/picture">
+                            <pic:pic xmlns:pic="http://schemas.openxmlformats.org/drawingml/2006/picture">
+                              <pic:nvPicPr>
+                                <pic:cNvPr id="1" name=""/>
+                                <pic:cNvPicPr/>
+                              </pic:nvPicPr>
+                              <pic:blipFill>
+                                <a:blip r:embed="rId13"/>
+                                <a:stretch>
+                                  <a:fillRect/>
+                                </a:stretch>
+                              </pic:blipFill>
+                              <pic:spPr>
+                                <a:xfrm>
+                                  <a:off x="0" y="0"/>
+                                  <a:ext cx="3166670" cy="1714299"/>
+                                </a:xfrm>
+                                <a:prstGeom prst="rect">
+                                  <a:avLst/>
+                                </a:prstGeom>
+                              </pic:spPr>
+                            </pic:pic>
+                          </a:graphicData>
+                        </a:graphic>
+                      </wp:inline>
+                    </w:drawing>
+                  </w:r>
+                </w:p>
+              </w:tc>
+            </w:tr>
+          </w:tbl>
+          <w:p>
+            <w:pPr>
+              <w:jc w:val="center"/>
+              <w:rPr>
+                <w:b/>
+                <w:bCs w:val="0"/>
+              </w:rPr>
+            </w:pPr>
+          </w:p>
+          <w:p>
+            <w:r>
+              <w:t xml:space="preserve">Above </w:t>
+            </w:r>
+            <w:r>
+              <w:t>are the changes made to the introduction screen, showing how hard it was to read prior to the change. This was noted in all test cases</w:t>
+            </w:r>
+            <w:r>
+              <w:t>.</w:t>
+            </w:r>
+          </w:p>
           <w:p/>
-          <w:p/>
-          <w:p/>
-          <w:p/>
-          <w:p/>
-          <w:p/>
-          <w:p/>
-          <w:p/>
+          <w:p>
+            <w:r>
+              <w:t>For this change, I increased the font size and lowered the blue outline slightly so it wasn’t so harsh.</w:t>
+            </w:r>
+          </w:p>
           <w:p/>
           <w:p/>
         </w:tc>
@@ -2619,7 +2958,7 @@
                           <pic:cNvPicPr/>
                         </pic:nvPicPr>
                         <pic:blipFill>
-                          <a:blip r:embed="rId12"/>
+                          <a:blip r:embed="rId14"/>
                           <a:stretch>
                             <a:fillRect/>
                           </a:stretch>
@@ -2952,7 +3291,7 @@
                           <pic:cNvPicPr/>
                         </pic:nvPicPr>
                         <pic:blipFill>
-                          <a:blip r:embed="rId13"/>
+                          <a:blip r:embed="rId15"/>
                           <a:stretch>
                             <a:fillRect/>
                           </a:stretch>
@@ -3340,7 +3679,7 @@
                           <pic:cNvPicPr/>
                         </pic:nvPicPr>
                         <pic:blipFill>
-                          <a:blip r:embed="rId14"/>
+                          <a:blip r:embed="rId16"/>
                           <a:stretch>
                             <a:fillRect/>
                           </a:stretch>
@@ -3708,7 +4047,7 @@
                           <pic:cNvPicPr/>
                         </pic:nvPicPr>
                         <pic:blipFill>
-                          <a:blip r:embed="rId15"/>
+                          <a:blip r:embed="rId17"/>
                           <a:stretch>
                             <a:fillRect/>
                           </a:stretch>
@@ -4053,7 +4392,7 @@
                           <pic:cNvPicPr/>
                         </pic:nvPicPr>
                         <pic:blipFill>
-                          <a:blip r:embed="rId16"/>
+                          <a:blip r:embed="rId18"/>
                           <a:stretch>
                             <a:fillRect/>
                           </a:stretch>
@@ -4362,13 +4701,15 @@
             </w:r>
             <w:r>
               <w:rPr>
-                <w:noProof/>
+                <w:b/>
+                <w:bCs w:val="0"/>
+                <w:iCs/>
               </w:rPr>
               <w:drawing>
-                <wp:inline distT="0" distB="0" distL="0" distR="0" wp14:anchorId="5FE35805" wp14:editId="25CF658A">
-                  <wp:extent cx="5810250" cy="3260436"/>
-                  <wp:effectExtent l="0" t="0" r="0" b="0"/>
-                  <wp:docPr id="1867495089" name="Picture 1"/>
+                <wp:inline distT="0" distB="0" distL="0" distR="0" wp14:anchorId="50971F67" wp14:editId="0BBED2DA">
+                  <wp:extent cx="6202018" cy="3357502"/>
+                  <wp:effectExtent l="0" t="0" r="8890" b="0"/>
+                  <wp:docPr id="1" name="Picture 1"/>
                   <wp:cNvGraphicFramePr>
                     <a:graphicFrameLocks xmlns:a="http://schemas.openxmlformats.org/drawingml/2006/main" noChangeAspect="1"/>
                   </wp:cNvGraphicFramePr>
@@ -4376,11 +4717,11 @@
                     <a:graphicData uri="http://schemas.openxmlformats.org/drawingml/2006/picture">
                       <pic:pic xmlns:pic="http://schemas.openxmlformats.org/drawingml/2006/picture">
                         <pic:nvPicPr>
-                          <pic:cNvPr id="1867495089" name=""/>
+                          <pic:cNvPr id="1" name=""/>
                           <pic:cNvPicPr/>
                         </pic:nvPicPr>
                         <pic:blipFill>
-                          <a:blip r:embed="rId17"/>
+                          <a:blip r:embed="rId13"/>
                           <a:stretch>
                             <a:fillRect/>
                           </a:stretch>
@@ -4388,7 +4729,7 @@
                         <pic:spPr>
                           <a:xfrm>
                             <a:off x="0" y="0"/>
-                            <a:ext cx="5817721" cy="3264628"/>
+                            <a:ext cx="6205058" cy="3359148"/>
                           </a:xfrm>
                           <a:prstGeom prst="rect">
                             <a:avLst/>
@@ -4672,7 +5013,6 @@
           <w:bCs w:val="0"/>
           <w:szCs w:val="22"/>
         </w:rPr>
-        <w:lastRenderedPageBreak/>
         <w:t>Version History</w:t>
       </w:r>
       <w:r>
@@ -5395,7 +5735,13 @@
           </w:tcPr>
           <w:p>
             <w:r>
-              <w:t>The game has 3 main locations:</w:t>
+              <w:t xml:space="preserve">The game has </w:t>
+            </w:r>
+            <w:r>
+              <w:t>4</w:t>
+            </w:r>
+            <w:r>
+              <w:t xml:space="preserve"> main locations:</w:t>
             </w:r>
           </w:p>
           <w:p>
@@ -5406,6 +5752,14 @@
           <w:p>
             <w:r>
               <w:t>- Silo: Where chicken feed is stored and where aliens go to eat to replenish hunger</w:t>
+            </w:r>
+          </w:p>
+          <w:p>
+            <w:r>
+              <w:t xml:space="preserve">- </w:t>
+            </w:r>
+            <w:r>
+              <w:t>Bucket Spawn: This is where aliens pickup buckets to then carry eggs to the spaceship</w:t>
             </w:r>
           </w:p>
           <w:p>
@@ -5527,7 +5881,6 @@
                 <w:b/>
                 <w:bCs w:val="0"/>
               </w:rPr>
-              <w:lastRenderedPageBreak/>
               <w:t>Stretch Goals</w:t>
             </w:r>
           </w:p>
@@ -5638,10 +5991,25 @@
           </w:tcPr>
           <w:p>
             <w:r>
-              <w:t>Hunger slowly drains as the aliens steal eggs. When it gets too low, they’ll stop their tasks and go eat</w:t>
+              <w:t xml:space="preserve">Hunger slowly drains as the aliens steal eggs. When it gets too low, they’ll </w:t>
+            </w:r>
+            <w:r>
+              <w:t>finish</w:t>
+            </w:r>
+            <w:r>
+              <w:t xml:space="preserve"> their</w:t>
+            </w:r>
+            <w:r>
+              <w:t xml:space="preserve"> current</w:t>
+            </w:r>
+            <w:r>
+              <w:t xml:space="preserve"> tasks and go eat</w:t>
             </w:r>
             <w:r>
               <w:t xml:space="preserve"> from the chicken feeders. They eat Chicken Feed</w:t>
+            </w:r>
+            <w:r>
+              <w:t>.</w:t>
             </w:r>
           </w:p>
         </w:tc>
@@ -5841,8 +6209,8 @@
     </w:p>
     <w:p/>
     <w:sectPr>
-      <w:headerReference w:type="default" r:id="rId18"/>
-      <w:footerReference w:type="default" r:id="rId19"/>
+      <w:headerReference w:type="default" r:id="rId19"/>
+      <w:footerReference w:type="default" r:id="rId20"/>
       <w:pgSz w:w="11906" w:h="16838" w:code="9"/>
       <w:pgMar w:top="851" w:right="851" w:bottom="851" w:left="851" w:header="567" w:footer="342" w:gutter="0"/>
       <w:cols w:space="720"/>
@@ -5853,7 +6221,7 @@
 </file>
 
 <file path=word/endnotes.xml><?xml version="1.0" encoding="utf-8"?>
-<w:endnotes xmlns:wpc="http://schemas.microsoft.com/office/word/2010/wordprocessingCanvas" xmlns:cx="http://schemas.microsoft.com/office/drawing/2014/chartex" xmlns:cx1="http://schemas.microsoft.com/office/drawing/2015/9/8/chartex" xmlns:cx2="http://schemas.microsoft.com/office/drawing/2015/10/21/chartex" xmlns:cx3="http://schemas.microsoft.com/office/drawing/2016/5/9/chartex" xmlns:cx4="http://schemas.microsoft.com/office/drawing/2016/5/10/chartex" xmlns:cx5="http://schemas.microsoft.com/office/drawing/2016/5/11/chartex" xmlns:cx6="http://schemas.microsoft.com/office/drawing/2016/5/12/chartex" xmlns:cx7="http://schemas.microsoft.com/office/drawing/2016/5/13/chartex" xmlns:cx8="http://schemas.microsoft.com/office/drawing/2016/5/14/chartex" xmlns:mc="http://schemas.openxmlformats.org/markup-compatibility/2006" xmlns:aink="http://schemas.microsoft.com/office/drawing/2016/ink" xmlns:am3d="http://schemas.microsoft.com/office/drawing/2017/model3d" xmlns:o="urn:schemas-microsoft-com:office:office" xmlns:oel="http://schemas.microsoft.com/office/2019/extlst" xmlns:r="http://schemas.openxmlformats.org/officeDocument/2006/relationships" xmlns:m="http://schemas.openxmlformats.org/officeDocument/2006/math" xmlns:v="urn:schemas-microsoft-com:vml" xmlns:wp14="http://schemas.microsoft.com/office/word/2010/wordprocessingDrawing" xmlns:wp="http://schemas.openxmlformats.org/drawingml/2006/wordprocessingDrawing" xmlns:w10="urn:schemas-microsoft-com:office:word" xmlns:w="http://schemas.openxmlformats.org/wordprocessingml/2006/main" xmlns:w14="http://schemas.microsoft.com/office/word/2010/wordml" xmlns:w15="http://schemas.microsoft.com/office/word/2012/wordml" xmlns:w16cex="http://schemas.microsoft.com/office/word/2018/wordml/cex" xmlns:w16cid="http://schemas.microsoft.com/office/word/2016/wordml/cid" xmlns:w16="http://schemas.microsoft.com/office/word/2018/wordml" xmlns:w16du="http://schemas.microsoft.com/office/word/2023/wordml/word16du" xmlns:w16sdtdh="http://schemas.microsoft.com/office/word/2020/wordml/sdtdatahash" xmlns:w16sdtfl="http://schemas.microsoft.com/office/word/2024/wordml/sdtformatlock" xmlns:w16se="http://schemas.microsoft.com/office/word/2015/wordml/symex" xmlns:wpg="http://schemas.microsoft.com/office/word/2010/wordprocessingGroup" xmlns:wpi="http://schemas.microsoft.com/office/word/2010/wordprocessingInk" xmlns:wne="http://schemas.microsoft.com/office/word/2006/wordml" xmlns:wps="http://schemas.microsoft.com/office/word/2010/wordprocessingShape" mc:Ignorable="w14 w15 w16se w16cid w16 w16cex w16sdtdh w16sdtfl w16du wp14">
+<w:endnotes xmlns:wpc="http://schemas.microsoft.com/office/word/2010/wordprocessingCanvas" xmlns:cx="http://schemas.microsoft.com/office/drawing/2014/chartex" xmlns:cx1="http://schemas.microsoft.com/office/drawing/2015/9/8/chartex" xmlns:cx2="http://schemas.microsoft.com/office/drawing/2015/10/21/chartex" xmlns:cx3="http://schemas.microsoft.com/office/drawing/2016/5/9/chartex" xmlns:cx4="http://schemas.microsoft.com/office/drawing/2016/5/10/chartex" xmlns:cx5="http://schemas.microsoft.com/office/drawing/2016/5/11/chartex" xmlns:cx6="http://schemas.microsoft.com/office/drawing/2016/5/12/chartex" xmlns:cx7="http://schemas.microsoft.com/office/drawing/2016/5/13/chartex" xmlns:cx8="http://schemas.microsoft.com/office/drawing/2016/5/14/chartex" xmlns:mc="http://schemas.openxmlformats.org/markup-compatibility/2006" xmlns:aink="http://schemas.microsoft.com/office/drawing/2016/ink" xmlns:am3d="http://schemas.microsoft.com/office/drawing/2017/model3d" xmlns:o="urn:schemas-microsoft-com:office:office" xmlns:oel="http://schemas.microsoft.com/office/2019/extlst" xmlns:r="http://schemas.openxmlformats.org/officeDocument/2006/relationships" xmlns:m="http://schemas.openxmlformats.org/officeDocument/2006/math" xmlns:v="urn:schemas-microsoft-com:vml" xmlns:wp14="http://schemas.microsoft.com/office/word/2010/wordprocessingDrawing" xmlns:wp="http://schemas.openxmlformats.org/drawingml/2006/wordprocessingDrawing" xmlns:w10="urn:schemas-microsoft-com:office:word" xmlns:w="http://schemas.openxmlformats.org/wordprocessingml/2006/main" xmlns:w14="http://schemas.microsoft.com/office/word/2010/wordml" xmlns:w15="http://schemas.microsoft.com/office/word/2012/wordml" xmlns:w16cex="http://schemas.microsoft.com/office/word/2018/wordml/cex" xmlns:w16cid="http://schemas.microsoft.com/office/word/2016/wordml/cid" xmlns:w16="http://schemas.microsoft.com/office/word/2018/wordml" xmlns:w16sdtdh="http://schemas.microsoft.com/office/word/2020/wordml/sdtdatahash" xmlns:w16se="http://schemas.microsoft.com/office/word/2015/wordml/symex" xmlns:wpg="http://schemas.microsoft.com/office/word/2010/wordprocessingGroup" xmlns:wpi="http://schemas.microsoft.com/office/word/2010/wordprocessingInk" xmlns:wne="http://schemas.microsoft.com/office/word/2006/wordml" xmlns:wps="http://schemas.microsoft.com/office/word/2010/wordprocessingShape" mc:Ignorable="w14 w15 w16se w16cid w16 w16cex w16sdtdh wp14">
   <w:endnote w:type="separator" w:id="-1">
     <w:p>
       <w:r>
@@ -5872,7 +6240,7 @@
 </file>
 
 <file path=word/footer1.xml><?xml version="1.0" encoding="utf-8"?>
-<w:ftr xmlns:wpc="http://schemas.microsoft.com/office/word/2010/wordprocessingCanvas" xmlns:cx="http://schemas.microsoft.com/office/drawing/2014/chartex" xmlns:cx1="http://schemas.microsoft.com/office/drawing/2015/9/8/chartex" xmlns:cx2="http://schemas.microsoft.com/office/drawing/2015/10/21/chartex" xmlns:cx3="http://schemas.microsoft.com/office/drawing/2016/5/9/chartex" xmlns:cx4="http://schemas.microsoft.com/office/drawing/2016/5/10/chartex" xmlns:cx5="http://schemas.microsoft.com/office/drawing/2016/5/11/chartex" xmlns:cx6="http://schemas.microsoft.com/office/drawing/2016/5/12/chartex" xmlns:cx7="http://schemas.microsoft.com/office/drawing/2016/5/13/chartex" xmlns:cx8="http://schemas.microsoft.com/office/drawing/2016/5/14/chartex" xmlns:mc="http://schemas.openxmlformats.org/markup-compatibility/2006" xmlns:aink="http://schemas.microsoft.com/office/drawing/2016/ink" xmlns:am3d="http://schemas.microsoft.com/office/drawing/2017/model3d" xmlns:o="urn:schemas-microsoft-com:office:office" xmlns:oel="http://schemas.microsoft.com/office/2019/extlst" xmlns:r="http://schemas.openxmlformats.org/officeDocument/2006/relationships" xmlns:m="http://schemas.openxmlformats.org/officeDocument/2006/math" xmlns:v="urn:schemas-microsoft-com:vml" xmlns:wp14="http://schemas.microsoft.com/office/word/2010/wordprocessingDrawing" xmlns:wp="http://schemas.openxmlformats.org/drawingml/2006/wordprocessingDrawing" xmlns:w10="urn:schemas-microsoft-com:office:word" xmlns:w="http://schemas.openxmlformats.org/wordprocessingml/2006/main" xmlns:w14="http://schemas.microsoft.com/office/word/2010/wordml" xmlns:w15="http://schemas.microsoft.com/office/word/2012/wordml" xmlns:w16cex="http://schemas.microsoft.com/office/word/2018/wordml/cex" xmlns:w16cid="http://schemas.microsoft.com/office/word/2016/wordml/cid" xmlns:w16="http://schemas.microsoft.com/office/word/2018/wordml" xmlns:w16du="http://schemas.microsoft.com/office/word/2023/wordml/word16du" xmlns:w16sdtdh="http://schemas.microsoft.com/office/word/2020/wordml/sdtdatahash" xmlns:w16sdtfl="http://schemas.microsoft.com/office/word/2024/wordml/sdtformatlock" xmlns:w16se="http://schemas.microsoft.com/office/word/2015/wordml/symex" xmlns:wpg="http://schemas.microsoft.com/office/word/2010/wordprocessingGroup" xmlns:wpi="http://schemas.microsoft.com/office/word/2010/wordprocessingInk" xmlns:wne="http://schemas.microsoft.com/office/word/2006/wordml" xmlns:wps="http://schemas.microsoft.com/office/word/2010/wordprocessingShape" mc:Ignorable="w14 w15 w16se w16cid w16 w16cex w16sdtdh w16sdtfl w16du wp14">
+<w:ftr xmlns:wpc="http://schemas.microsoft.com/office/word/2010/wordprocessingCanvas" xmlns:cx="http://schemas.microsoft.com/office/drawing/2014/chartex" xmlns:cx1="http://schemas.microsoft.com/office/drawing/2015/9/8/chartex" xmlns:cx2="http://schemas.microsoft.com/office/drawing/2015/10/21/chartex" xmlns:cx3="http://schemas.microsoft.com/office/drawing/2016/5/9/chartex" xmlns:cx4="http://schemas.microsoft.com/office/drawing/2016/5/10/chartex" xmlns:cx5="http://schemas.microsoft.com/office/drawing/2016/5/11/chartex" xmlns:cx6="http://schemas.microsoft.com/office/drawing/2016/5/12/chartex" xmlns:cx7="http://schemas.microsoft.com/office/drawing/2016/5/13/chartex" xmlns:cx8="http://schemas.microsoft.com/office/drawing/2016/5/14/chartex" xmlns:mc="http://schemas.openxmlformats.org/markup-compatibility/2006" xmlns:aink="http://schemas.microsoft.com/office/drawing/2016/ink" xmlns:am3d="http://schemas.microsoft.com/office/drawing/2017/model3d" xmlns:o="urn:schemas-microsoft-com:office:office" xmlns:oel="http://schemas.microsoft.com/office/2019/extlst" xmlns:r="http://schemas.openxmlformats.org/officeDocument/2006/relationships" xmlns:m="http://schemas.openxmlformats.org/officeDocument/2006/math" xmlns:v="urn:schemas-microsoft-com:vml" xmlns:wp14="http://schemas.microsoft.com/office/word/2010/wordprocessingDrawing" xmlns:wp="http://schemas.openxmlformats.org/drawingml/2006/wordprocessingDrawing" xmlns:w10="urn:schemas-microsoft-com:office:word" xmlns:w="http://schemas.openxmlformats.org/wordprocessingml/2006/main" xmlns:w14="http://schemas.microsoft.com/office/word/2010/wordml" xmlns:w15="http://schemas.microsoft.com/office/word/2012/wordml" xmlns:w16cex="http://schemas.microsoft.com/office/word/2018/wordml/cex" xmlns:w16cid="http://schemas.microsoft.com/office/word/2016/wordml/cid" xmlns:w16="http://schemas.microsoft.com/office/word/2018/wordml" xmlns:w16sdtdh="http://schemas.microsoft.com/office/word/2020/wordml/sdtdatahash" xmlns:w16se="http://schemas.microsoft.com/office/word/2015/wordml/symex" xmlns:wpg="http://schemas.microsoft.com/office/word/2010/wordprocessingGroup" xmlns:wpi="http://schemas.microsoft.com/office/word/2010/wordprocessingInk" xmlns:wne="http://schemas.microsoft.com/office/word/2006/wordml" xmlns:wps="http://schemas.microsoft.com/office/word/2010/wordprocessingShape" mc:Ignorable="w14 w15 w16se w16cid w16 w16cex w16sdtdh wp14">
   <w:tbl>
     <w:tblPr>
       <w:tblStyle w:val="TableGrid3"/>
@@ -6294,7 +6662,7 @@
 </file>
 
 <file path=word/footnotes.xml><?xml version="1.0" encoding="utf-8"?>
-<w:footnotes xmlns:wpc="http://schemas.microsoft.com/office/word/2010/wordprocessingCanvas" xmlns:cx="http://schemas.microsoft.com/office/drawing/2014/chartex" xmlns:cx1="http://schemas.microsoft.com/office/drawing/2015/9/8/chartex" xmlns:cx2="http://schemas.microsoft.com/office/drawing/2015/10/21/chartex" xmlns:cx3="http://schemas.microsoft.com/office/drawing/2016/5/9/chartex" xmlns:cx4="http://schemas.microsoft.com/office/drawing/2016/5/10/chartex" xmlns:cx5="http://schemas.microsoft.com/office/drawing/2016/5/11/chartex" xmlns:cx6="http://schemas.microsoft.com/office/drawing/2016/5/12/chartex" xmlns:cx7="http://schemas.microsoft.com/office/drawing/2016/5/13/chartex" xmlns:cx8="http://schemas.microsoft.com/office/drawing/2016/5/14/chartex" xmlns:mc="http://schemas.openxmlformats.org/markup-compatibility/2006" xmlns:aink="http://schemas.microsoft.com/office/drawing/2016/ink" xmlns:am3d="http://schemas.microsoft.com/office/drawing/2017/model3d" xmlns:o="urn:schemas-microsoft-com:office:office" xmlns:oel="http://schemas.microsoft.com/office/2019/extlst" xmlns:r="http://schemas.openxmlformats.org/officeDocument/2006/relationships" xmlns:m="http://schemas.openxmlformats.org/officeDocument/2006/math" xmlns:v="urn:schemas-microsoft-com:vml" xmlns:wp14="http://schemas.microsoft.com/office/word/2010/wordprocessingDrawing" xmlns:wp="http://schemas.openxmlformats.org/drawingml/2006/wordprocessingDrawing" xmlns:w10="urn:schemas-microsoft-com:office:word" xmlns:w="http://schemas.openxmlformats.org/wordprocessingml/2006/main" xmlns:w14="http://schemas.microsoft.com/office/word/2010/wordml" xmlns:w15="http://schemas.microsoft.com/office/word/2012/wordml" xmlns:w16cex="http://schemas.microsoft.com/office/word/2018/wordml/cex" xmlns:w16cid="http://schemas.microsoft.com/office/word/2016/wordml/cid" xmlns:w16="http://schemas.microsoft.com/office/word/2018/wordml" xmlns:w16du="http://schemas.microsoft.com/office/word/2023/wordml/word16du" xmlns:w16sdtdh="http://schemas.microsoft.com/office/word/2020/wordml/sdtdatahash" xmlns:w16sdtfl="http://schemas.microsoft.com/office/word/2024/wordml/sdtformatlock" xmlns:w16se="http://schemas.microsoft.com/office/word/2015/wordml/symex" xmlns:wpg="http://schemas.microsoft.com/office/word/2010/wordprocessingGroup" xmlns:wpi="http://schemas.microsoft.com/office/word/2010/wordprocessingInk" xmlns:wne="http://schemas.microsoft.com/office/word/2006/wordml" xmlns:wps="http://schemas.microsoft.com/office/word/2010/wordprocessingShape" mc:Ignorable="w14 w15 w16se w16cid w16 w16cex w16sdtdh w16sdtfl w16du wp14">
+<w:footnotes xmlns:wpc="http://schemas.microsoft.com/office/word/2010/wordprocessingCanvas" xmlns:cx="http://schemas.microsoft.com/office/drawing/2014/chartex" xmlns:cx1="http://schemas.microsoft.com/office/drawing/2015/9/8/chartex" xmlns:cx2="http://schemas.microsoft.com/office/drawing/2015/10/21/chartex" xmlns:cx3="http://schemas.microsoft.com/office/drawing/2016/5/9/chartex" xmlns:cx4="http://schemas.microsoft.com/office/drawing/2016/5/10/chartex" xmlns:cx5="http://schemas.microsoft.com/office/drawing/2016/5/11/chartex" xmlns:cx6="http://schemas.microsoft.com/office/drawing/2016/5/12/chartex" xmlns:cx7="http://schemas.microsoft.com/office/drawing/2016/5/13/chartex" xmlns:cx8="http://schemas.microsoft.com/office/drawing/2016/5/14/chartex" xmlns:mc="http://schemas.openxmlformats.org/markup-compatibility/2006" xmlns:aink="http://schemas.microsoft.com/office/drawing/2016/ink" xmlns:am3d="http://schemas.microsoft.com/office/drawing/2017/model3d" xmlns:o="urn:schemas-microsoft-com:office:office" xmlns:oel="http://schemas.microsoft.com/office/2019/extlst" xmlns:r="http://schemas.openxmlformats.org/officeDocument/2006/relationships" xmlns:m="http://schemas.openxmlformats.org/officeDocument/2006/math" xmlns:v="urn:schemas-microsoft-com:vml" xmlns:wp14="http://schemas.microsoft.com/office/word/2010/wordprocessingDrawing" xmlns:wp="http://schemas.openxmlformats.org/drawingml/2006/wordprocessingDrawing" xmlns:w10="urn:schemas-microsoft-com:office:word" xmlns:w="http://schemas.openxmlformats.org/wordprocessingml/2006/main" xmlns:w14="http://schemas.microsoft.com/office/word/2010/wordml" xmlns:w15="http://schemas.microsoft.com/office/word/2012/wordml" xmlns:w16cex="http://schemas.microsoft.com/office/word/2018/wordml/cex" xmlns:w16cid="http://schemas.microsoft.com/office/word/2016/wordml/cid" xmlns:w16="http://schemas.microsoft.com/office/word/2018/wordml" xmlns:w16sdtdh="http://schemas.microsoft.com/office/word/2020/wordml/sdtdatahash" xmlns:w16se="http://schemas.microsoft.com/office/word/2015/wordml/symex" xmlns:wpg="http://schemas.microsoft.com/office/word/2010/wordprocessingGroup" xmlns:wpi="http://schemas.microsoft.com/office/word/2010/wordprocessingInk" xmlns:wne="http://schemas.microsoft.com/office/word/2006/wordml" xmlns:wps="http://schemas.microsoft.com/office/word/2010/wordprocessingShape" mc:Ignorable="w14 w15 w16se w16cid w16 w16cex w16sdtdh wp14">
   <w:footnote w:type="separator" w:id="-1">
     <w:p>
       <w:r>
@@ -6313,7 +6681,7 @@
 </file>
 
 <file path=word/header1.xml><?xml version="1.0" encoding="utf-8"?>
-<w:hdr xmlns:wpc="http://schemas.microsoft.com/office/word/2010/wordprocessingCanvas" xmlns:cx="http://schemas.microsoft.com/office/drawing/2014/chartex" xmlns:cx1="http://schemas.microsoft.com/office/drawing/2015/9/8/chartex" xmlns:cx2="http://schemas.microsoft.com/office/drawing/2015/10/21/chartex" xmlns:cx3="http://schemas.microsoft.com/office/drawing/2016/5/9/chartex" xmlns:cx4="http://schemas.microsoft.com/office/drawing/2016/5/10/chartex" xmlns:cx5="http://schemas.microsoft.com/office/drawing/2016/5/11/chartex" xmlns:cx6="http://schemas.microsoft.com/office/drawing/2016/5/12/chartex" xmlns:cx7="http://schemas.microsoft.com/office/drawing/2016/5/13/chartex" xmlns:cx8="http://schemas.microsoft.com/office/drawing/2016/5/14/chartex" xmlns:mc="http://schemas.openxmlformats.org/markup-compatibility/2006" xmlns:aink="http://schemas.microsoft.com/office/drawing/2016/ink" xmlns:am3d="http://schemas.microsoft.com/office/drawing/2017/model3d" xmlns:o="urn:schemas-microsoft-com:office:office" xmlns:oel="http://schemas.microsoft.com/office/2019/extlst" xmlns:r="http://schemas.openxmlformats.org/officeDocument/2006/relationships" xmlns:m="http://schemas.openxmlformats.org/officeDocument/2006/math" xmlns:v="urn:schemas-microsoft-com:vml" xmlns:wp14="http://schemas.microsoft.com/office/word/2010/wordprocessingDrawing" xmlns:wp="http://schemas.openxmlformats.org/drawingml/2006/wordprocessingDrawing" xmlns:w10="urn:schemas-microsoft-com:office:word" xmlns:w="http://schemas.openxmlformats.org/wordprocessingml/2006/main" xmlns:w14="http://schemas.microsoft.com/office/word/2010/wordml" xmlns:w15="http://schemas.microsoft.com/office/word/2012/wordml" xmlns:w16cex="http://schemas.microsoft.com/office/word/2018/wordml/cex" xmlns:w16cid="http://schemas.microsoft.com/office/word/2016/wordml/cid" xmlns:w16="http://schemas.microsoft.com/office/word/2018/wordml" xmlns:w16du="http://schemas.microsoft.com/office/word/2023/wordml/word16du" xmlns:w16sdtdh="http://schemas.microsoft.com/office/word/2020/wordml/sdtdatahash" xmlns:w16sdtfl="http://schemas.microsoft.com/office/word/2024/wordml/sdtformatlock" xmlns:w16se="http://schemas.microsoft.com/office/word/2015/wordml/symex" xmlns:wpg="http://schemas.microsoft.com/office/word/2010/wordprocessingGroup" xmlns:wpi="http://schemas.microsoft.com/office/word/2010/wordprocessingInk" xmlns:wne="http://schemas.microsoft.com/office/word/2006/wordml" xmlns:wps="http://schemas.microsoft.com/office/word/2010/wordprocessingShape" mc:Ignorable="w14 w15 w16se w16cid w16 w16cex w16sdtdh w16sdtfl w16du wp14">
+<w:hdr xmlns:wpc="http://schemas.microsoft.com/office/word/2010/wordprocessingCanvas" xmlns:cx="http://schemas.microsoft.com/office/drawing/2014/chartex" xmlns:cx1="http://schemas.microsoft.com/office/drawing/2015/9/8/chartex" xmlns:cx2="http://schemas.microsoft.com/office/drawing/2015/10/21/chartex" xmlns:cx3="http://schemas.microsoft.com/office/drawing/2016/5/9/chartex" xmlns:cx4="http://schemas.microsoft.com/office/drawing/2016/5/10/chartex" xmlns:cx5="http://schemas.microsoft.com/office/drawing/2016/5/11/chartex" xmlns:cx6="http://schemas.microsoft.com/office/drawing/2016/5/12/chartex" xmlns:cx7="http://schemas.microsoft.com/office/drawing/2016/5/13/chartex" xmlns:cx8="http://schemas.microsoft.com/office/drawing/2016/5/14/chartex" xmlns:mc="http://schemas.openxmlformats.org/markup-compatibility/2006" xmlns:aink="http://schemas.microsoft.com/office/drawing/2016/ink" xmlns:am3d="http://schemas.microsoft.com/office/drawing/2017/model3d" xmlns:o="urn:schemas-microsoft-com:office:office" xmlns:oel="http://schemas.microsoft.com/office/2019/extlst" xmlns:r="http://schemas.openxmlformats.org/officeDocument/2006/relationships" xmlns:m="http://schemas.openxmlformats.org/officeDocument/2006/math" xmlns:v="urn:schemas-microsoft-com:vml" xmlns:wp14="http://schemas.microsoft.com/office/word/2010/wordprocessingDrawing" xmlns:wp="http://schemas.openxmlformats.org/drawingml/2006/wordprocessingDrawing" xmlns:w10="urn:schemas-microsoft-com:office:word" xmlns:w="http://schemas.openxmlformats.org/wordprocessingml/2006/main" xmlns:w14="http://schemas.microsoft.com/office/word/2010/wordml" xmlns:w15="http://schemas.microsoft.com/office/word/2012/wordml" xmlns:w16cex="http://schemas.microsoft.com/office/word/2018/wordml/cex" xmlns:w16cid="http://schemas.microsoft.com/office/word/2016/wordml/cid" xmlns:w16="http://schemas.microsoft.com/office/word/2018/wordml" xmlns:w16sdtdh="http://schemas.microsoft.com/office/word/2020/wordml/sdtdatahash" xmlns:w16se="http://schemas.microsoft.com/office/word/2015/wordml/symex" xmlns:wpg="http://schemas.microsoft.com/office/word/2010/wordprocessingGroup" xmlns:wpi="http://schemas.microsoft.com/office/word/2010/wordprocessingInk" xmlns:wne="http://schemas.microsoft.com/office/word/2006/wordml" xmlns:wps="http://schemas.microsoft.com/office/word/2010/wordprocessingShape" mc:Ignorable="w14 w15 w16se w16cid w16 w16cex w16sdtdh wp14">
   <w:p>
     <w:pPr>
       <w:pStyle w:val="Heading1"/>
@@ -6555,7 +6923,7 @@
 </file>
 
 <file path=word/numbering.xml><?xml version="1.0" encoding="utf-8"?>
-<w:numbering xmlns:wpc="http://schemas.microsoft.com/office/word/2010/wordprocessingCanvas" xmlns:cx="http://schemas.microsoft.com/office/drawing/2014/chartex" xmlns:cx1="http://schemas.microsoft.com/office/drawing/2015/9/8/chartex" xmlns:cx2="http://schemas.microsoft.com/office/drawing/2015/10/21/chartex" xmlns:cx3="http://schemas.microsoft.com/office/drawing/2016/5/9/chartex" xmlns:cx4="http://schemas.microsoft.com/office/drawing/2016/5/10/chartex" xmlns:cx5="http://schemas.microsoft.com/office/drawing/2016/5/11/chartex" xmlns:cx6="http://schemas.microsoft.com/office/drawing/2016/5/12/chartex" xmlns:cx7="http://schemas.microsoft.com/office/drawing/2016/5/13/chartex" xmlns:cx8="http://schemas.microsoft.com/office/drawing/2016/5/14/chartex" xmlns:mc="http://schemas.openxmlformats.org/markup-compatibility/2006" xmlns:aink="http://schemas.microsoft.com/office/drawing/2016/ink" xmlns:am3d="http://schemas.microsoft.com/office/drawing/2017/model3d" xmlns:o="urn:schemas-microsoft-com:office:office" xmlns:oel="http://schemas.microsoft.com/office/2019/extlst" xmlns:r="http://schemas.openxmlformats.org/officeDocument/2006/relationships" xmlns:m="http://schemas.openxmlformats.org/officeDocument/2006/math" xmlns:v="urn:schemas-microsoft-com:vml" xmlns:wp14="http://schemas.microsoft.com/office/word/2010/wordprocessingDrawing" xmlns:wp="http://schemas.openxmlformats.org/drawingml/2006/wordprocessingDrawing" xmlns:w10="urn:schemas-microsoft-com:office:word" xmlns:w="http://schemas.openxmlformats.org/wordprocessingml/2006/main" xmlns:w14="http://schemas.microsoft.com/office/word/2010/wordml" xmlns:w15="http://schemas.microsoft.com/office/word/2012/wordml" xmlns:w16cex="http://schemas.microsoft.com/office/word/2018/wordml/cex" xmlns:w16cid="http://schemas.microsoft.com/office/word/2016/wordml/cid" xmlns:w16="http://schemas.microsoft.com/office/word/2018/wordml" xmlns:w16du="http://schemas.microsoft.com/office/word/2023/wordml/word16du" xmlns:w16sdtdh="http://schemas.microsoft.com/office/word/2020/wordml/sdtdatahash" xmlns:w16sdtfl="http://schemas.microsoft.com/office/word/2024/wordml/sdtformatlock" xmlns:w16se="http://schemas.microsoft.com/office/word/2015/wordml/symex" xmlns:wpg="http://schemas.microsoft.com/office/word/2010/wordprocessingGroup" xmlns:wpi="http://schemas.microsoft.com/office/word/2010/wordprocessingInk" xmlns:wne="http://schemas.microsoft.com/office/word/2006/wordml" xmlns:wps="http://schemas.microsoft.com/office/word/2010/wordprocessingShape" mc:Ignorable="w14 w15 w16se w16cid w16 w16cex w16sdtdh w16sdtfl w16du wp14">
+<w:numbering xmlns:wpc="http://schemas.microsoft.com/office/word/2010/wordprocessingCanvas" xmlns:cx="http://schemas.microsoft.com/office/drawing/2014/chartex" xmlns:cx1="http://schemas.microsoft.com/office/drawing/2015/9/8/chartex" xmlns:cx2="http://schemas.microsoft.com/office/drawing/2015/10/21/chartex" xmlns:cx3="http://schemas.microsoft.com/office/drawing/2016/5/9/chartex" xmlns:cx4="http://schemas.microsoft.com/office/drawing/2016/5/10/chartex" xmlns:cx5="http://schemas.microsoft.com/office/drawing/2016/5/11/chartex" xmlns:cx6="http://schemas.microsoft.com/office/drawing/2016/5/12/chartex" xmlns:cx7="http://schemas.microsoft.com/office/drawing/2016/5/13/chartex" xmlns:cx8="http://schemas.microsoft.com/office/drawing/2016/5/14/chartex" xmlns:mc="http://schemas.openxmlformats.org/markup-compatibility/2006" xmlns:aink="http://schemas.microsoft.com/office/drawing/2016/ink" xmlns:am3d="http://schemas.microsoft.com/office/drawing/2017/model3d" xmlns:o="urn:schemas-microsoft-com:office:office" xmlns:oel="http://schemas.microsoft.com/office/2019/extlst" xmlns:r="http://schemas.openxmlformats.org/officeDocument/2006/relationships" xmlns:m="http://schemas.openxmlformats.org/officeDocument/2006/math" xmlns:v="urn:schemas-microsoft-com:vml" xmlns:wp14="http://schemas.microsoft.com/office/word/2010/wordprocessingDrawing" xmlns:wp="http://schemas.openxmlformats.org/drawingml/2006/wordprocessingDrawing" xmlns:w10="urn:schemas-microsoft-com:office:word" xmlns:w="http://schemas.openxmlformats.org/wordprocessingml/2006/main" xmlns:w14="http://schemas.microsoft.com/office/word/2010/wordml" xmlns:w15="http://schemas.microsoft.com/office/word/2012/wordml" xmlns:w16cex="http://schemas.microsoft.com/office/word/2018/wordml/cex" xmlns:w16cid="http://schemas.microsoft.com/office/word/2016/wordml/cid" xmlns:w16="http://schemas.microsoft.com/office/word/2018/wordml" xmlns:w16sdtdh="http://schemas.microsoft.com/office/word/2020/wordml/sdtdatahash" xmlns:w16se="http://schemas.microsoft.com/office/word/2015/wordml/symex" xmlns:wpg="http://schemas.microsoft.com/office/word/2010/wordprocessingGroup" xmlns:wpi="http://schemas.microsoft.com/office/word/2010/wordprocessingInk" xmlns:wne="http://schemas.microsoft.com/office/word/2006/wordml" xmlns:wps="http://schemas.microsoft.com/office/word/2010/wordprocessingShape" mc:Ignorable="w14 w15 w16se w16cid w16 w16cex w16sdtdh wp14">
   <w:abstractNum w:abstractNumId="0" w15:restartNumberingAfterBreak="0">
     <w:nsid w:val="04711F1E"/>
     <w:multiLevelType w:val="multilevel"/>
@@ -9136,7 +9504,7 @@
 </file>
 
 <file path=word/styles.xml><?xml version="1.0" encoding="utf-8"?>
-<w:styles xmlns:mc="http://schemas.openxmlformats.org/markup-compatibility/2006" xmlns:r="http://schemas.openxmlformats.org/officeDocument/2006/relationships" xmlns:w="http://schemas.openxmlformats.org/wordprocessingml/2006/main" xmlns:w14="http://schemas.microsoft.com/office/word/2010/wordml" xmlns:w15="http://schemas.microsoft.com/office/word/2012/wordml" xmlns:w16cex="http://schemas.microsoft.com/office/word/2018/wordml/cex" xmlns:w16cid="http://schemas.microsoft.com/office/word/2016/wordml/cid" xmlns:w16="http://schemas.microsoft.com/office/word/2018/wordml" xmlns:w16du="http://schemas.microsoft.com/office/word/2023/wordml/word16du" xmlns:w16sdtdh="http://schemas.microsoft.com/office/word/2020/wordml/sdtdatahash" xmlns:w16sdtfl="http://schemas.microsoft.com/office/word/2024/wordml/sdtformatlock" xmlns:w16se="http://schemas.microsoft.com/office/word/2015/wordml/symex" mc:Ignorable="w14 w15 w16se w16cid w16 w16cex w16sdtdh w16sdtfl w16du">
+<w:styles xmlns:mc="http://schemas.openxmlformats.org/markup-compatibility/2006" xmlns:r="http://schemas.openxmlformats.org/officeDocument/2006/relationships" xmlns:w="http://schemas.openxmlformats.org/wordprocessingml/2006/main" xmlns:w14="http://schemas.microsoft.com/office/word/2010/wordml" xmlns:w15="http://schemas.microsoft.com/office/word/2012/wordml" xmlns:w16cex="http://schemas.microsoft.com/office/word/2018/wordml/cex" xmlns:w16cid="http://schemas.microsoft.com/office/word/2016/wordml/cid" xmlns:w16="http://schemas.microsoft.com/office/word/2018/wordml" xmlns:w16sdtdh="http://schemas.microsoft.com/office/word/2020/wordml/sdtdatahash" xmlns:w16se="http://schemas.microsoft.com/office/word/2015/wordml/symex" mc:Ignorable="w14 w15 w16se w16cid w16 w16cex w16sdtdh">
   <w:docDefaults>
     <w:rPrDefault>
       <w:rPr>
@@ -10011,7 +10379,7 @@
 </file>
 
 <file path=word/glossary/document.xml><?xml version="1.0" encoding="utf-8"?>
-<w:glossaryDocument xmlns:wpc="http://schemas.microsoft.com/office/word/2010/wordprocessingCanvas" xmlns:cx="http://schemas.microsoft.com/office/drawing/2014/chartex" xmlns:cx1="http://schemas.microsoft.com/office/drawing/2015/9/8/chartex" xmlns:cx2="http://schemas.microsoft.com/office/drawing/2015/10/21/chartex" xmlns:cx3="http://schemas.microsoft.com/office/drawing/2016/5/9/chartex" xmlns:cx4="http://schemas.microsoft.com/office/drawing/2016/5/10/chartex" xmlns:cx5="http://schemas.microsoft.com/office/drawing/2016/5/11/chartex" xmlns:cx6="http://schemas.microsoft.com/office/drawing/2016/5/12/chartex" xmlns:cx7="http://schemas.microsoft.com/office/drawing/2016/5/13/chartex" xmlns:cx8="http://schemas.microsoft.com/office/drawing/2016/5/14/chartex" xmlns:mc="http://schemas.openxmlformats.org/markup-compatibility/2006" xmlns:aink="http://schemas.microsoft.com/office/drawing/2016/ink" xmlns:am3d="http://schemas.microsoft.com/office/drawing/2017/model3d" xmlns:o="urn:schemas-microsoft-com:office:office" xmlns:oel="http://schemas.microsoft.com/office/2019/extlst" xmlns:r="http://schemas.openxmlformats.org/officeDocument/2006/relationships" xmlns:m="http://schemas.openxmlformats.org/officeDocument/2006/math" xmlns:v="urn:schemas-microsoft-com:vml" xmlns:wp14="http://schemas.microsoft.com/office/word/2010/wordprocessingDrawing" xmlns:wp="http://schemas.openxmlformats.org/drawingml/2006/wordprocessingDrawing" xmlns:w10="urn:schemas-microsoft-com:office:word" xmlns:w="http://schemas.openxmlformats.org/wordprocessingml/2006/main" xmlns:w14="http://schemas.microsoft.com/office/word/2010/wordml" xmlns:w15="http://schemas.microsoft.com/office/word/2012/wordml" xmlns:w16cex="http://schemas.microsoft.com/office/word/2018/wordml/cex" xmlns:w16cid="http://schemas.microsoft.com/office/word/2016/wordml/cid" xmlns:w16="http://schemas.microsoft.com/office/word/2018/wordml" xmlns:w16du="http://schemas.microsoft.com/office/word/2023/wordml/word16du" xmlns:w16sdtdh="http://schemas.microsoft.com/office/word/2020/wordml/sdtdatahash" xmlns:w16sdtfl="http://schemas.microsoft.com/office/word/2024/wordml/sdtformatlock" xmlns:w16se="http://schemas.microsoft.com/office/word/2015/wordml/symex" xmlns:wpg="http://schemas.microsoft.com/office/word/2010/wordprocessingGroup" xmlns:wpi="http://schemas.microsoft.com/office/word/2010/wordprocessingInk" xmlns:wne="http://schemas.microsoft.com/office/word/2006/wordml" xmlns:wps="http://schemas.microsoft.com/office/word/2010/wordprocessingShape" mc:Ignorable="w14 w15 w16se w16cid w16 w16cex w16sdtdh w16sdtfl w16du wp14">
+<w:glossaryDocument xmlns:wpc="http://schemas.microsoft.com/office/word/2010/wordprocessingCanvas" xmlns:cx="http://schemas.microsoft.com/office/drawing/2014/chartex" xmlns:cx1="http://schemas.microsoft.com/office/drawing/2015/9/8/chartex" xmlns:cx2="http://schemas.microsoft.com/office/drawing/2015/10/21/chartex" xmlns:cx3="http://schemas.microsoft.com/office/drawing/2016/5/9/chartex" xmlns:cx4="http://schemas.microsoft.com/office/drawing/2016/5/10/chartex" xmlns:cx5="http://schemas.microsoft.com/office/drawing/2016/5/11/chartex" xmlns:cx6="http://schemas.microsoft.com/office/drawing/2016/5/12/chartex" xmlns:cx7="http://schemas.microsoft.com/office/drawing/2016/5/13/chartex" xmlns:cx8="http://schemas.microsoft.com/office/drawing/2016/5/14/chartex" xmlns:mc="http://schemas.openxmlformats.org/markup-compatibility/2006" xmlns:aink="http://schemas.microsoft.com/office/drawing/2016/ink" xmlns:am3d="http://schemas.microsoft.com/office/drawing/2017/model3d" xmlns:o="urn:schemas-microsoft-com:office:office" xmlns:oel="http://schemas.microsoft.com/office/2019/extlst" xmlns:r="http://schemas.openxmlformats.org/officeDocument/2006/relationships" xmlns:m="http://schemas.openxmlformats.org/officeDocument/2006/math" xmlns:v="urn:schemas-microsoft-com:vml" xmlns:wp14="http://schemas.microsoft.com/office/word/2010/wordprocessingDrawing" xmlns:wp="http://schemas.openxmlformats.org/drawingml/2006/wordprocessingDrawing" xmlns:w10="urn:schemas-microsoft-com:office:word" xmlns:w="http://schemas.openxmlformats.org/wordprocessingml/2006/main" xmlns:w14="http://schemas.microsoft.com/office/word/2010/wordml" xmlns:w15="http://schemas.microsoft.com/office/word/2012/wordml" xmlns:w16cex="http://schemas.microsoft.com/office/word/2018/wordml/cex" xmlns:w16cid="http://schemas.microsoft.com/office/word/2016/wordml/cid" xmlns:w16="http://schemas.microsoft.com/office/word/2018/wordml" xmlns:w16sdtdh="http://schemas.microsoft.com/office/word/2020/wordml/sdtdatahash" xmlns:w16se="http://schemas.microsoft.com/office/word/2015/wordml/symex" xmlns:wpg="http://schemas.microsoft.com/office/word/2010/wordprocessingGroup" xmlns:wpi="http://schemas.microsoft.com/office/word/2010/wordprocessingInk" xmlns:wne="http://schemas.microsoft.com/office/word/2006/wordml" xmlns:wps="http://schemas.microsoft.com/office/word/2010/wordprocessingShape" mc:Ignorable="w14 w15 w16se w16cid w16 w16cex w16sdtdh wp14">
   <w:docParts>
     <w:docPart>
       <w:docPartPr>
@@ -10049,7 +10417,7 @@
 </file>
 
 <file path=word/glossary/fontTable.xml><?xml version="1.0" encoding="utf-8"?>
-<w:fonts xmlns:mc="http://schemas.openxmlformats.org/markup-compatibility/2006" xmlns:r="http://schemas.openxmlformats.org/officeDocument/2006/relationships" xmlns:w="http://schemas.openxmlformats.org/wordprocessingml/2006/main" xmlns:w14="http://schemas.microsoft.com/office/word/2010/wordml" xmlns:w15="http://schemas.microsoft.com/office/word/2012/wordml" xmlns:w16cex="http://schemas.microsoft.com/office/word/2018/wordml/cex" xmlns:w16cid="http://schemas.microsoft.com/office/word/2016/wordml/cid" xmlns:w16="http://schemas.microsoft.com/office/word/2018/wordml" xmlns:w16du="http://schemas.microsoft.com/office/word/2023/wordml/word16du" xmlns:w16sdtdh="http://schemas.microsoft.com/office/word/2020/wordml/sdtdatahash" xmlns:w16sdtfl="http://schemas.microsoft.com/office/word/2024/wordml/sdtformatlock" xmlns:w16se="http://schemas.microsoft.com/office/word/2015/wordml/symex" mc:Ignorable="w14 w15 w16se w16cid w16 w16cex w16sdtdh w16sdtfl w16du">
+<w:fonts xmlns:mc="http://schemas.openxmlformats.org/markup-compatibility/2006" xmlns:r="http://schemas.openxmlformats.org/officeDocument/2006/relationships" xmlns:w="http://schemas.openxmlformats.org/wordprocessingml/2006/main" xmlns:w14="http://schemas.microsoft.com/office/word/2010/wordml" xmlns:w15="http://schemas.microsoft.com/office/word/2012/wordml" xmlns:w16cex="http://schemas.microsoft.com/office/word/2018/wordml/cex" xmlns:w16cid="http://schemas.microsoft.com/office/word/2016/wordml/cid" xmlns:w16="http://schemas.microsoft.com/office/word/2018/wordml" xmlns:w16sdtdh="http://schemas.microsoft.com/office/word/2020/wordml/sdtdatahash" xmlns:w16se="http://schemas.microsoft.com/office/word/2015/wordml/symex" mc:Ignorable="w14 w15 w16se w16cid w16 w16cex w16sdtdh">
   <w:font w:name="Times New Roman">
     <w:panose1 w:val="02020603050405020304"/>
     <w:charset w:val="00"/>
@@ -10107,7 +10475,7 @@
     <w:charset w:val="00"/>
     <w:family w:val="swiss"/>
     <w:pitch w:val="variable"/>
-    <w:sig w:usb0="E4002EFF" w:usb1="C000247B" w:usb2="00000009" w:usb3="00000000" w:csb0="000001FF" w:csb1="00000000"/>
+    <w:sig w:usb0="E4002EFF" w:usb1="C200247B" w:usb2="00000009" w:usb3="00000000" w:csb0="000001FF" w:csb1="00000000"/>
   </w:font>
   <w:font w:name="Tahoma">
     <w:panose1 w:val="020B0604030504040204"/>
@@ -10147,7 +10515,7 @@
 </file>
 
 <file path=word/glossary/settings.xml><?xml version="1.0" encoding="utf-8"?>
-<w:settings xmlns:mc="http://schemas.openxmlformats.org/markup-compatibility/2006" xmlns:o="urn:schemas-microsoft-com:office:office" xmlns:r="http://schemas.openxmlformats.org/officeDocument/2006/relationships" xmlns:m="http://schemas.openxmlformats.org/officeDocument/2006/math" xmlns:v="urn:schemas-microsoft-com:vml" xmlns:w10="urn:schemas-microsoft-com:office:word" xmlns:w="http://schemas.openxmlformats.org/wordprocessingml/2006/main" xmlns:w14="http://schemas.microsoft.com/office/word/2010/wordml" xmlns:w15="http://schemas.microsoft.com/office/word/2012/wordml" xmlns:w16cex="http://schemas.microsoft.com/office/word/2018/wordml/cex" xmlns:w16cid="http://schemas.microsoft.com/office/word/2016/wordml/cid" xmlns:w16="http://schemas.microsoft.com/office/word/2018/wordml" xmlns:w16du="http://schemas.microsoft.com/office/word/2023/wordml/word16du" xmlns:w16sdtdh="http://schemas.microsoft.com/office/word/2020/wordml/sdtdatahash" xmlns:w16sdtfl="http://schemas.microsoft.com/office/word/2024/wordml/sdtformatlock" xmlns:w16se="http://schemas.microsoft.com/office/word/2015/wordml/symex" xmlns:sl="http://schemas.openxmlformats.org/schemaLibrary/2006/main" mc:Ignorable="w14 w15 w16se w16cid w16 w16cex w16sdtdh w16sdtfl w16du">
+<w:settings xmlns:mc="http://schemas.openxmlformats.org/markup-compatibility/2006" xmlns:o="urn:schemas-microsoft-com:office:office" xmlns:r="http://schemas.openxmlformats.org/officeDocument/2006/relationships" xmlns:m="http://schemas.openxmlformats.org/officeDocument/2006/math" xmlns:v="urn:schemas-microsoft-com:vml" xmlns:w10="urn:schemas-microsoft-com:office:word" xmlns:w="http://schemas.openxmlformats.org/wordprocessingml/2006/main" xmlns:w14="http://schemas.microsoft.com/office/word/2010/wordml" xmlns:w15="http://schemas.microsoft.com/office/word/2012/wordml" xmlns:w16cex="http://schemas.microsoft.com/office/word/2018/wordml/cex" xmlns:w16cid="http://schemas.microsoft.com/office/word/2016/wordml/cid" xmlns:w16="http://schemas.microsoft.com/office/word/2018/wordml" xmlns:w16sdtdh="http://schemas.microsoft.com/office/word/2020/wordml/sdtdatahash" xmlns:w16se="http://schemas.microsoft.com/office/word/2015/wordml/symex" xmlns:sl="http://schemas.openxmlformats.org/schemaLibrary/2006/main" mc:Ignorable="w14 w15 w16se w16cid w16 w16cex w16sdtdh">
   <w:view w:val="normal"/>
   <w:defaultTabStop w:val="720"/>
   <w:characterSpacingControl w:val="doNotCompress"/>
@@ -10173,11 +10541,13 @@
     <w:rsid w:val="00640779"/>
     <w:rsid w:val="00640DCB"/>
     <w:rsid w:val="0066722D"/>
+    <w:rsid w:val="00744C80"/>
     <w:rsid w:val="007760F7"/>
     <w:rsid w:val="007F2ABF"/>
     <w:rsid w:val="00866388"/>
     <w:rsid w:val="00894C7D"/>
     <w:rsid w:val="009535F8"/>
+    <w:rsid w:val="00D573FD"/>
     <w:rsid w:val="00E44F2C"/>
     <w:rsid w:val="00EF076B"/>
     <w:rsid w:val="00F0777A"/>
@@ -10205,7 +10575,7 @@
 </file>
 
 <file path=word/glossary/styles.xml><?xml version="1.0" encoding="utf-8"?>
-<w:styles xmlns:mc="http://schemas.openxmlformats.org/markup-compatibility/2006" xmlns:r="http://schemas.openxmlformats.org/officeDocument/2006/relationships" xmlns:w="http://schemas.openxmlformats.org/wordprocessingml/2006/main" xmlns:w14="http://schemas.microsoft.com/office/word/2010/wordml" xmlns:w15="http://schemas.microsoft.com/office/word/2012/wordml" xmlns:w16cex="http://schemas.microsoft.com/office/word/2018/wordml/cex" xmlns:w16cid="http://schemas.microsoft.com/office/word/2016/wordml/cid" xmlns:w16="http://schemas.microsoft.com/office/word/2018/wordml" xmlns:w16du="http://schemas.microsoft.com/office/word/2023/wordml/word16du" xmlns:w16sdtdh="http://schemas.microsoft.com/office/word/2020/wordml/sdtdatahash" xmlns:w16sdtfl="http://schemas.microsoft.com/office/word/2024/wordml/sdtformatlock" xmlns:w16se="http://schemas.microsoft.com/office/word/2015/wordml/symex" mc:Ignorable="w14 w15 w16se w16cid w16 w16cex w16sdtdh w16sdtfl w16du">
+<w:styles xmlns:mc="http://schemas.openxmlformats.org/markup-compatibility/2006" xmlns:r="http://schemas.openxmlformats.org/officeDocument/2006/relationships" xmlns:w="http://schemas.openxmlformats.org/wordprocessingml/2006/main" xmlns:w14="http://schemas.microsoft.com/office/word/2010/wordml" xmlns:w15="http://schemas.microsoft.com/office/word/2012/wordml" xmlns:w16cex="http://schemas.microsoft.com/office/word/2018/wordml/cex" xmlns:w16cid="http://schemas.microsoft.com/office/word/2016/wordml/cid" xmlns:w16="http://schemas.microsoft.com/office/word/2018/wordml" xmlns:w16sdtdh="http://schemas.microsoft.com/office/word/2020/wordml/sdtdatahash" xmlns:w16se="http://schemas.microsoft.com/office/word/2015/wordml/symex" mc:Ignorable="w14 w15 w16se w16cid w16 w16cex w16sdtdh">
   <w:docDefaults>
     <w:rPrDefault>
       <w:rPr>
@@ -10657,7 +11027,7 @@
 </file>
 
 <file path=word/glossary/webSettings.xml><?xml version="1.0" encoding="utf-8"?>
-<w:webSettings xmlns:mc="http://schemas.openxmlformats.org/markup-compatibility/2006" xmlns:r="http://schemas.openxmlformats.org/officeDocument/2006/relationships" xmlns:w="http://schemas.openxmlformats.org/wordprocessingml/2006/main" xmlns:w14="http://schemas.microsoft.com/office/word/2010/wordml" xmlns:w15="http://schemas.microsoft.com/office/word/2012/wordml" xmlns:w16cex="http://schemas.microsoft.com/office/word/2018/wordml/cex" xmlns:w16cid="http://schemas.microsoft.com/office/word/2016/wordml/cid" xmlns:w16="http://schemas.microsoft.com/office/word/2018/wordml" xmlns:w16du="http://schemas.microsoft.com/office/word/2023/wordml/word16du" xmlns:w16sdtdh="http://schemas.microsoft.com/office/word/2020/wordml/sdtdatahash" xmlns:w16sdtfl="http://schemas.microsoft.com/office/word/2024/wordml/sdtformatlock" xmlns:w16se="http://schemas.microsoft.com/office/word/2015/wordml/symex" mc:Ignorable="w14 w15 w16se w16cid w16 w16cex w16sdtdh w16sdtfl w16du">
+<w:webSettings xmlns:mc="http://schemas.openxmlformats.org/markup-compatibility/2006" xmlns:r="http://schemas.openxmlformats.org/officeDocument/2006/relationships" xmlns:w="http://schemas.openxmlformats.org/wordprocessingml/2006/main" xmlns:w14="http://schemas.microsoft.com/office/word/2010/wordml" xmlns:w15="http://schemas.microsoft.com/office/word/2012/wordml" xmlns:w16cex="http://schemas.microsoft.com/office/word/2018/wordml/cex" xmlns:w16cid="http://schemas.microsoft.com/office/word/2016/wordml/cid" xmlns:w16="http://schemas.microsoft.com/office/word/2018/wordml" xmlns:w16sdtdh="http://schemas.microsoft.com/office/word/2020/wordml/sdtdatahash" xmlns:w16se="http://schemas.microsoft.com/office/word/2015/wordml/symex" mc:Ignorable="w14 w15 w16se w16cid w16 w16cex w16sdtdh">
   <w:optimizeForBrowser/>
   <w:allowPNG/>
 </w:webSettings>
@@ -10949,10 +11319,6 @@
 </file>
 
 <file path=customXml/item1.xml><?xml version="1.0" encoding="utf-8"?>
-<b:Sources xmlns:b="http://schemas.openxmlformats.org/officeDocument/2006/bibliography" xmlns="http://schemas.openxmlformats.org/officeDocument/2006/bibliography" SelectedStyle="\APA.XSL" StyleName="APA"/>
-</file>
-
-<file path=customXml/item2.xml><?xml version="1.0" encoding="utf-8"?>
 <p:properties xmlns:p="http://schemas.microsoft.com/office/2006/metadata/properties" xmlns:xsi="http://www.w3.org/2001/XMLSchema-instance" xmlns:pc="http://schemas.microsoft.com/office/infopath/2007/PartnerControls">
   <documentManagement>
     <CostCentre xmlns="c369ec6e-e776-4cfb-9aab-85bbb2d3059b">XQD Quality and Development</CostCentre>
@@ -10985,7 +11351,24 @@
 </p:properties>
 </file>
 
+<file path=customXml/item2.xml><?xml version="1.0" encoding="utf-8"?>
+<b:Sources xmlns:b="http://schemas.openxmlformats.org/officeDocument/2006/bibliography" xmlns="http://schemas.openxmlformats.org/officeDocument/2006/bibliography" SelectedStyle="\APA.XSL" StyleName="APA"/>
+</file>
+
 <file path=customXml/item3.xml><?xml version="1.0" encoding="utf-8"?>
+<?mso-contentType ?>
+<FormTemplates xmlns="http://schemas.microsoft.com/sharepoint/v3/contenttype/forms">
+  <Display>DocumentLibraryForm</Display>
+  <Edit>DocumentLibraryForm</Edit>
+  <New>DocumentLibraryForm</New>
+</FormTemplates>
+</file>
+
+<file path=customXml/item4.xml><?xml version="1.0" encoding="utf-8"?>
+<LongProperties xmlns="http://schemas.microsoft.com/office/2006/metadata/longProperties"/>
+</file>
+
+<file path=customXml/item5.xml><?xml version="1.0" encoding="utf-8"?>
 <ct:contentTypeSchema xmlns:ct="http://schemas.microsoft.com/office/2006/metadata/contentType" xmlns:ma="http://schemas.microsoft.com/office/2006/metadata/properties/metaAttributes" ct:_="" ma:_="" ma:contentTypeName="Central Form" ma:contentTypeID="0x010100AF4BA1430F2E4F53972F8E467AD5D5BB00F4FFD117931942ADB9A5D6774F1709C200CCDBFE8310C71941B6FD8EACFAC6F789" ma:contentTypeVersion="3" ma:contentTypeDescription="Central Form Document" ma:contentTypeScope="" ma:versionID="6a0f9cc5cb7c4653d829a9673163df79">
   <xsd:schema xmlns:xsd="http://www.w3.org/2001/XMLSchema" xmlns:xs="http://www.w3.org/2001/XMLSchema" xmlns:p="http://schemas.microsoft.com/office/2006/metadata/properties" xmlns:ns1="http://schemas.microsoft.com/sharepoint/v3" xmlns:ns2="c369ec6e-e776-4cfb-9aab-85bbb2d3059b" xmlns:ns3="7f1ed7a5-13c4-4640-91cb-37295ecf9af4" targetNamespace="http://schemas.microsoft.com/office/2006/metadata/properties" ma:root="true" ma:fieldsID="3178bf5ea224a66b73ab1c50cae6997f" ns1:_="" ns2:_="" ns3:_="">
     <xsd:import namespace="http://schemas.microsoft.com/sharepoint/v3"/>
@@ -11294,28 +11677,7 @@
 </ct:contentTypeSchema>
 </file>
 
-<file path=customXml/item4.xml><?xml version="1.0" encoding="utf-8"?>
-<LongProperties xmlns="http://schemas.microsoft.com/office/2006/metadata/longProperties"/>
-</file>
-
-<file path=customXml/item5.xml><?xml version="1.0" encoding="utf-8"?>
-<?mso-contentType ?>
-<FormTemplates xmlns="http://schemas.microsoft.com/sharepoint/v3/contenttype/forms">
-  <Display>DocumentLibraryForm</Display>
-  <Edit>DocumentLibraryForm</Edit>
-  <New>DocumentLibraryForm</New>
-</FormTemplates>
-</file>
-
 <file path=customXml/itemProps1.xml><?xml version="1.0" encoding="utf-8"?>
-<ds:datastoreItem xmlns:ds="http://schemas.openxmlformats.org/officeDocument/2006/customXml" ds:itemID="{270A1387-5032-421F-ABE8-3776CE5E5F42}">
-  <ds:schemaRefs>
-    <ds:schemaRef ds:uri="http://schemas.openxmlformats.org/officeDocument/2006/bibliography"/>
-  </ds:schemaRefs>
-</ds:datastoreItem>
-</file>
-
-<file path=customXml/itemProps2.xml><?xml version="1.0" encoding="utf-8"?>
 <ds:datastoreItem xmlns:ds="http://schemas.openxmlformats.org/officeDocument/2006/customXml" ds:itemID="{A16F99D5-FAF9-47B7-BB2E-CAC1EF9F3B71}">
   <ds:schemaRefs>
     <ds:schemaRef ds:uri="http://schemas.microsoft.com/office/2006/metadata/properties"/>
@@ -11327,7 +11689,31 @@
 </ds:datastoreItem>
 </file>
 
+<file path=customXml/itemProps2.xml><?xml version="1.0" encoding="utf-8"?>
+<ds:datastoreItem xmlns:ds="http://schemas.openxmlformats.org/officeDocument/2006/customXml" ds:itemID="{270A1387-5032-421F-ABE8-3776CE5E5F42}">
+  <ds:schemaRefs>
+    <ds:schemaRef ds:uri="http://schemas.openxmlformats.org/officeDocument/2006/bibliography"/>
+  </ds:schemaRefs>
+</ds:datastoreItem>
+</file>
+
 <file path=customXml/itemProps3.xml><?xml version="1.0" encoding="utf-8"?>
+<ds:datastoreItem xmlns:ds="http://schemas.openxmlformats.org/officeDocument/2006/customXml" ds:itemID="{96001339-1F25-4BDD-94F9-AA3400008571}">
+  <ds:schemaRefs>
+    <ds:schemaRef ds:uri="http://schemas.microsoft.com/sharepoint/v3/contenttype/forms"/>
+  </ds:schemaRefs>
+</ds:datastoreItem>
+</file>
+
+<file path=customXml/itemProps4.xml><?xml version="1.0" encoding="utf-8"?>
+<ds:datastoreItem xmlns:ds="http://schemas.openxmlformats.org/officeDocument/2006/customXml" ds:itemID="{ED9C3AC7-65F6-444B-AAD9-BED76FF91658}">
+  <ds:schemaRefs>
+    <ds:schemaRef ds:uri="http://schemas.microsoft.com/office/2006/metadata/longProperties"/>
+  </ds:schemaRefs>
+</ds:datastoreItem>
+</file>
+
+<file path=customXml/itemProps5.xml><?xml version="1.0" encoding="utf-8"?>
 <ds:datastoreItem xmlns:ds="http://schemas.openxmlformats.org/officeDocument/2006/customXml" ds:itemID="{4EF5FC08-38BC-4F0F-9CE8-A9969E73295E}">
   <ds:schemaRefs>
     <ds:schemaRef ds:uri="http://schemas.microsoft.com/office/2006/metadata/contentType"/>
@@ -11345,20 +11731,4 @@
     <ds:schemaRef ds:uri="http://schemas.microsoft.com/internal/obd"/>
   </ds:schemaRefs>
 </ds:datastoreItem>
-</file>
-
-<file path=customXml/itemProps4.xml><?xml version="1.0" encoding="utf-8"?>
-<ds:datastoreItem xmlns:ds="http://schemas.openxmlformats.org/officeDocument/2006/customXml" ds:itemID="{ED9C3AC7-65F6-444B-AAD9-BED76FF91658}">
-  <ds:schemaRefs>
-    <ds:schemaRef ds:uri="http://schemas.microsoft.com/office/2006/metadata/longProperties"/>
-  </ds:schemaRefs>
-</ds:datastoreItem>
-</file>
-
-<file path=customXml/itemProps5.xml><?xml version="1.0" encoding="utf-8"?>
-<ds:datastoreItem xmlns:ds="http://schemas.openxmlformats.org/officeDocument/2006/customXml" ds:itemID="{96001339-1F25-4BDD-94F9-AA3400008571}">
-  <ds:schemaRefs>
-    <ds:schemaRef ds:uri="http://schemas.microsoft.com/sharepoint/v3/contenttype/forms"/>
-  </ds:schemaRefs>
-</ds:datastoreItem>
 </file>
</xml_diff>